<commit_message>
avances en el digital twin
</commit_message>
<xml_diff>
--- a/CAMBRIDGE/bitacora/08-09-26 - Tipos de receptor con divergencia.docx
+++ b/CAMBRIDGE/bitacora/08-09-26 - Tipos de receptor con divergencia.docx
@@ -1793,6 +1793,166 @@
           </wp:inline>
         </w:drawing>
       </w:r>
+    </w:p>
+    <w:p>
+      <w:pPr>
+        <w:pStyle w:val="NoSpacing"/>
+        <w:rPr>
+          <w:rFonts w:ascii="Arial" w:hAnsi="Arial" w:cs="Arial"/>
+        </w:rPr>
+      </w:pPr>
+    </w:p>
+    <w:p>
+      <w:pPr>
+        <w:pStyle w:val="NoSpacing"/>
+        <w:rPr>
+          <w:rFonts w:ascii="Arial" w:hAnsi="Arial" w:cs="Arial"/>
+        </w:rPr>
+      </w:pPr>
+    </w:p>
+    <w:p>
+      <w:pPr>
+        <w:pStyle w:val="NoSpacing"/>
+        <w:rPr>
+          <w:rFonts w:ascii="Arial" w:hAnsi="Arial" w:cs="Arial"/>
+        </w:rPr>
+      </w:pPr>
+    </w:p>
+    <w:p>
+      <w:pPr>
+        <w:pStyle w:val="NoSpacing"/>
+        <w:rPr>
+          <w:rFonts w:ascii="Arial" w:hAnsi="Arial" w:cs="Arial"/>
+        </w:rPr>
+      </w:pPr>
+    </w:p>
+    <w:p>
+      <w:pPr>
+        <w:pStyle w:val="NoSpacing"/>
+        <w:rPr>
+          <w:rFonts w:ascii="Arial" w:hAnsi="Arial" w:cs="Arial"/>
+        </w:rPr>
+      </w:pPr>
+    </w:p>
+    <w:p>
+      <w:pPr>
+        <w:pStyle w:val="NoSpacing"/>
+        <w:rPr>
+          <w:rFonts w:ascii="Arial" w:hAnsi="Arial" w:cs="Arial"/>
+        </w:rPr>
+      </w:pPr>
+      <w:r>
+        <w:rPr>
+          <w:rFonts w:ascii="Arial" w:hAnsi="Arial" w:cs="Arial"/>
+        </w:rPr>
+        <w:drawing>
+          <wp:inline distT="0" distB="0" distL="0" distR="0" wp14:anchorId="3FB0B443" wp14:editId="79004973">
+            <wp:extent cx="3858163" cy="3524742"/>
+            <wp:effectExtent l="0" t="0" r="0" b="0"/>
+            <wp:docPr id="7" name="Picture 6">
+              <a:extLst xmlns:a="http://schemas.openxmlformats.org/drawingml/2006/main">
+                <a:ext uri="{FF2B5EF4-FFF2-40B4-BE49-F238E27FC236}">
+                  <a16:creationId xmlns:a16="http://schemas.microsoft.com/office/drawing/2014/main" id="{75EBD79A-FCBF-BBAC-0C12-DA4BC612AE37}"/>
+                </a:ext>
+              </a:extLst>
+            </wp:docPr>
+            <wp:cNvGraphicFramePr>
+              <a:graphicFrameLocks xmlns:a="http://schemas.openxmlformats.org/drawingml/2006/main" noChangeAspect="1"/>
+            </wp:cNvGraphicFramePr>
+            <a:graphic xmlns:a="http://schemas.openxmlformats.org/drawingml/2006/main">
+              <a:graphicData uri="http://schemas.openxmlformats.org/drawingml/2006/picture">
+                <pic:pic xmlns:pic="http://schemas.openxmlformats.org/drawingml/2006/picture">
+                  <pic:nvPicPr>
+                    <pic:cNvPr id="7" name="Picture 6">
+                      <a:extLst>
+                        <a:ext uri="{FF2B5EF4-FFF2-40B4-BE49-F238E27FC236}">
+                          <a16:creationId xmlns:a16="http://schemas.microsoft.com/office/drawing/2014/main" id="{75EBD79A-FCBF-BBAC-0C12-DA4BC612AE37}"/>
+                        </a:ext>
+                      </a:extLst>
+                    </pic:cNvPr>
+                    <pic:cNvPicPr>
+                      <a:picLocks noChangeAspect="1"/>
+                    </pic:cNvPicPr>
+                  </pic:nvPicPr>
+                  <pic:blipFill>
+                    <a:blip r:embed="rId14"/>
+                    <a:stretch>
+                      <a:fillRect/>
+                    </a:stretch>
+                  </pic:blipFill>
+                  <pic:spPr>
+                    <a:xfrm>
+                      <a:off x="0" y="0"/>
+                      <a:ext cx="3858163" cy="3524742"/>
+                    </a:xfrm>
+                    <a:prstGeom prst="rect">
+                      <a:avLst/>
+                    </a:prstGeom>
+                  </pic:spPr>
+                </pic:pic>
+              </a:graphicData>
+            </a:graphic>
+          </wp:inline>
+        </w:drawing>
+      </w:r>
+    </w:p>
+    <w:p>
+      <w:pPr>
+        <w:pStyle w:val="NoSpacing"/>
+        <w:rPr>
+          <w:rFonts w:ascii="Arial" w:hAnsi="Arial" w:cs="Arial"/>
+        </w:rPr>
+      </w:pPr>
+      <w:r>
+        <w:rPr>
+          <w:rFonts w:ascii="Arial" w:hAnsi="Arial" w:cs="Arial"/>
+          <w:lang w:val="en-US"/>
+        </w:rPr>
+        <w:t>L.</w:t>
+      </w:r>
+      <w:r>
+        <w:rPr>
+          <w:rFonts w:ascii="Arial" w:hAnsi="Arial" w:cs="Arial"/>
+          <w:lang w:val="en-US"/>
+        </w:rPr>
+        <w:t xml:space="preserve"> Qin</w:t>
+      </w:r>
+      <w:r>
+        <w:rPr>
+          <w:rFonts w:ascii="Arial" w:hAnsi="Arial" w:cs="Arial"/>
+          <w:lang w:val="en-US"/>
+        </w:rPr>
+        <w:t>, 2021</w:t>
+      </w:r>
+      <w:r>
+        <w:rPr>
+          <w:rFonts w:ascii="Arial" w:hAnsi="Arial" w:cs="Arial"/>
+          <w:lang w:val="en-US"/>
+        </w:rPr>
+        <w:t>, “</w:t>
+      </w:r>
+      <w:r>
+        <w:rPr>
+          <w:rFonts w:ascii="Arial" w:hAnsi="Arial" w:cs="Arial"/>
+          <w:lang w:val="en-US"/>
+        </w:rPr>
+        <w:t>High precision indoor positioning algorithm of single LED lamp based on A-Bayes</w:t>
+      </w:r>
+      <w:r>
+        <w:rPr>
+          <w:rFonts w:ascii="Arial" w:hAnsi="Arial" w:cs="Arial"/>
+          <w:lang w:val="en-US"/>
+        </w:rPr>
+        <w:t>”</w:t>
+      </w:r>
+    </w:p>
+    <w:p>
+      <w:pPr>
+        <w:pStyle w:val="NoSpacing"/>
+        <w:rPr>
+          <w:rFonts w:ascii="Arial" w:hAnsi="Arial" w:cs="Arial"/>
+        </w:rPr>
+      </w:pPr>
     </w:p>
     <w:sectPr>
       <w:pgSz w:w="11906" w:h="16838" w:code="9"/>
@@ -2410,7 +2570,6 @@
   <w:style w:type="character" w:default="1" w:styleId="DefaultParagraphFont">
     <w:name w:val="Default Paragraph Font"/>
     <w:uiPriority w:val="1"/>
-    <w:semiHidden/>
     <w:unhideWhenUsed/>
   </w:style>
   <w:style w:type="table" w:default="1" w:styleId="TableNormal">

</xml_diff>